<commit_message>
Replace rendered evidence with actual Terminal screenshots
</commit_message>
<xml_diff>
--- a/report/Advanced_Shell_Deliverable_1_Report.docx
+++ b/report/Advanced_Shell_Deliverable_1_Report.docx
@@ -396,7 +396,7 @@
           <w:color w:val="000000"/>
           <w:sz w:val="24"/>
         </w:rPr>
-        <w:t>A job is recorded as Running, Stopped, or Done. These are shell-level summaries: Running means the job has not stopped or completed, and may include a process that the kernel currently puts to sleep. A Ctrl-Z stop retains the job and its terminal settings. bg sends SIGCONT to its group; fg restores terminal ownership and saved settings before continuing it. This ordering follows POSIX job-control requirements (IEEE &amp; The Open Group, 2024c). Figure A3 demonstrates the complete sequence, including Ctrl-C termination after fg.</w:t>
+        <w:t>A job is recorded as Running, Stopped, or Done. These are shell-level summaries: Running means the job has not stopped or completed, and may include a process that the kernel currently puts to sleep. A Ctrl-Z stop retains the job and its terminal settings. bg sends SIGCONT to its group; fg restores terminal ownership and saved settings before continuing it. This ordering follows POSIX job-control requirements (IEEE &amp; The Open Group, 2024c). Figure A3 shows stopping, background continuation, and return to the foreground. Ctrl-C termination is checked separately by the integration tests.</w:t>
       </w:r>
     </w:p>
     <w:p>
@@ -531,7 +531,7 @@
           <w:color w:val="000000"/>
           <w:sz w:val="24"/>
         </w:rPr>
-        <w:t>Appendix A provides five terminal-session captures with their original text transcripts in the submission. Figure A1 covers file and directory commands, including empty-file output. Figure A2 independently checks a background PID and PGID with ps and terminates that process through kill. Figure A3 demonstrates fg and bg. Figure A4 shows invalid commands and inputs. Figure A5 adds clear, a background built-in, and exit. The PNGs render the recorded PTY output; they are reproducible session evidence rather than photographs of a native Terminal window.</w:t>
+        <w:t>Appendix A provides six actual macOS Terminal screenshots. Figure A1 shows file operations, input mistakes, and recovery. Figure A2 checks a background PID and PGID with ps and terminates that process through kill. Figure A3 demonstrates fg and bg. Figure A4 shows invalid commands and inputs. Figures A5 and A6 show the screen before and after clear, a background built-in, and exit status 0. Separate automated PTY transcripts are supplemental records from earlier sessions; they are not transcriptions of these screenshots.</w:t>
       </w:r>
     </w:p>
     <w:p>
@@ -1840,8 +1840,8 @@
       <w:r>
         <w:drawing>
           <wp:inline xmlns:a="http://schemas.openxmlformats.org/drawingml/2006/main" xmlns:pic="http://schemas.openxmlformats.org/drawingml/2006/picture">
-            <wp:extent cx="5943600" cy="3260725"/>
-            <wp:docPr id="1" name="Picture 1" descr="Recorded PTY output demonstrates pwd, echo, mkdir, cd, touch, ls, cat, rm, and rmdir. The sample text is a prepared fixture. Output continues after cat reads the empty notes.txt file."/>
+            <wp:extent cx="5943600" cy="4188017"/>
+            <wp:docPr id="1" name="Picture 1" descr="Actual Terminal screenshot showing directory changes, sample-file output, and cleanup. The filename notes.txtls explains the failed cat attempts; the user then removes that file and directory. Empty-file cat behavior is verified by regression tests."/>
             <wp:cNvGraphicFramePr>
               <a:graphicFrameLocks noChangeAspect="1"/>
             </wp:cNvGraphicFramePr>
@@ -1861,7 +1861,7 @@
                   <pic:spPr>
                     <a:xfrm>
                       <a:off x="0" y="0"/>
-                      <a:ext cx="5943600" cy="3260725"/>
+                      <a:ext cx="5943600" cy="4188017"/>
                     </a:xfrm>
                     <a:prstGeom prst="rect"/>
                   </pic:spPr>
@@ -1907,7 +1907,7 @@
           <w:color w:val="000000"/>
           <w:sz w:val="24"/>
         </w:rPr>
-        <w:t>Recorded PTY output demonstrates pwd, echo, mkdir, cd, touch, ls, cat, rm, and rmdir. The sample text is a prepared fixture. Output continues after cat reads the empty notes.txt file.</w:t>
+        <w:t>Actual Terminal screenshot showing directory changes, sample-file output, and cleanup. The filename notes.txtls explains the failed cat attempts; the user then removes that file and directory. Empty-file cat behavior is verified by regression tests.</w:t>
       </w:r>
     </w:p>
     <w:p>
@@ -1976,7 +1976,7 @@
       <w:r>
         <w:drawing>
           <wp:inline xmlns:a="http://schemas.openxmlformats.org/drawingml/2006/main" xmlns:pic="http://schemas.openxmlformats.org/drawingml/2006/picture">
-            <wp:extent cx="5943600" cy="2138045"/>
+            <wp:extent cx="5943600" cy="3850190"/>
             <wp:docPr id="2" name="Picture 2" descr="sleep runs asynchronously. jobs displays its shell state and group ID; ps independently confirms the PID and PGID. The built-in kill sends SIGTERM, and the completed child is reported as Done. PID = process ID; PGID = process-group ID."/>
             <wp:cNvGraphicFramePr>
               <a:graphicFrameLocks noChangeAspect="1"/>
@@ -1997,7 +1997,7 @@
                   <pic:spPr>
                     <a:xfrm>
                       <a:off x="0" y="0"/>
-                      <a:ext cx="5943600" cy="2138045"/>
+                      <a:ext cx="5943600" cy="3850190"/>
                     </a:xfrm>
                     <a:prstGeom prst="rect"/>
                   </pic:spPr>
@@ -2112,8 +2112,8 @@
       <w:r>
         <w:drawing>
           <wp:inline xmlns:a="http://schemas.openxmlformats.org/drawingml/2006/main" xmlns:pic="http://schemas.openxmlformats.org/drawingml/2006/picture">
-            <wp:extent cx="5943600" cy="2138045"/>
-            <wp:docPr id="3" name="Picture 3" descr="Ctrl-Z stops the same process, bg resumes its group, and fg returns it to the foreground. Ctrl-C then terminates it while the shell remains available for another command."/>
+            <wp:extent cx="5943600" cy="3817181"/>
+            <wp:docPr id="3" name="Picture 3" descr="Ctrl-Z stops the process, bg resumes its group, and fg returns it to the foreground. A second stop and fg are visible before the prompt returns. This screenshot does not establish Ctrl-C termination; that behavior is verified by the integration tests."/>
             <wp:cNvGraphicFramePr>
               <a:graphicFrameLocks noChangeAspect="1"/>
             </wp:cNvGraphicFramePr>
@@ -2133,7 +2133,7 @@
                   <pic:spPr>
                     <a:xfrm>
                       <a:off x="0" y="0"/>
-                      <a:ext cx="5943600" cy="2138045"/>
+                      <a:ext cx="5943600" cy="3817181"/>
                     </a:xfrm>
                     <a:prstGeom prst="rect"/>
                   </pic:spPr>
@@ -2179,7 +2179,7 @@
           <w:color w:val="000000"/>
           <w:sz w:val="24"/>
         </w:rPr>
-        <w:t>Ctrl-Z stops the same process, bg resumes its group, and fg returns it to the foreground. Ctrl-C then terminates it while the shell remains available for another command.</w:t>
+        <w:t>Ctrl-Z stops the process, bg resumes its group, and fg returns it to the foreground. A second stop and fg are visible before the prompt returns. This screenshot does not establish Ctrl-C termination; that behavior is verified by the integration tests.</w:t>
       </w:r>
     </w:p>
     <w:p>
@@ -2248,8 +2248,8 @@
       <w:r>
         <w:drawing>
           <wp:inline xmlns:a="http://schemas.openxmlformats.org/drawingml/2006/main" xmlns:pic="http://schemas.openxmlformats.org/drawingml/2006/picture">
-            <wp:extent cx="5943600" cy="3401060"/>
-            <wp:docPr id="4" name="Picture 4" descr="The session exercises missing commands and files, invalid directories, a nonempty directory, an invalid PID, unmatched quotes, an unsupported pipe, and a missing argument. The shell remains responsive."/>
+            <wp:extent cx="5943600" cy="3850190"/>
+            <wp:docPr id="4" name="Picture 4" descr="The session shows a missing command and file, an invalid directory and PID, unmatched quotes, an unsupported pipe, a missing argument, and an unknown job ID. Each error returns control to the prompt."/>
             <wp:cNvGraphicFramePr>
               <a:graphicFrameLocks noChangeAspect="1"/>
             </wp:cNvGraphicFramePr>
@@ -2269,7 +2269,7 @@
                   <pic:spPr>
                     <a:xfrm>
                       <a:off x="0" y="0"/>
-                      <a:ext cx="5943600" cy="3401060"/>
+                      <a:ext cx="5943600" cy="3850190"/>
                     </a:xfrm>
                     <a:prstGeom prst="rect"/>
                   </pic:spPr>
@@ -2315,7 +2315,7 @@
           <w:color w:val="000000"/>
           <w:sz w:val="24"/>
         </w:rPr>
-        <w:t>The session exercises missing commands and files, invalid directories, a nonempty directory, an invalid PID, unmatched quotes, an unsupported pipe, and a missing argument. The shell remains responsive.</w:t>
+        <w:t>The session shows a missing command and file, an invalid directory and PID, unmatched quotes, an unsupported pipe, a missing argument, and an unknown job ID. Each error returns control to the prompt.</w:t>
       </w:r>
     </w:p>
     <w:p>
@@ -2361,7 +2361,7 @@
           <w:color w:val="000000"/>
           <w:sz w:val="24"/>
         </w:rPr>
-        <w:t>Clear Background Built-in and Shell Exit</w:t>
+        <w:t>Terminal Before Clear</w:t>
       </w:r>
     </w:p>
     <w:p>
@@ -2384,8 +2384,8 @@
       <w:r>
         <w:drawing>
           <wp:inline xmlns:a="http://schemas.openxmlformats.org/drawingml/2006/main" xmlns:pic="http://schemas.openxmlformats.org/drawingml/2006/picture">
-            <wp:extent cx="5943600" cy="1717040"/>
-            <wp:docPr id="5" name="Picture 5" descr="clear emits its ANSI control sequence, which is omitted from the text rendering. The integration test checks its exact bytes. echo executes in a background child, and exit 0 ends the shell. ANSI = American National Standards Institute."/>
+            <wp:extent cx="5943600" cy="3895893"/>
+            <wp:docPr id="5" name="Picture 5" descr="The Terminal window retains earlier output, an echo result, and clear typed at the prompt before execution. Figure A6 shows the subsequent screen. The exact ANSI clear sequence is also checked by an integration test."/>
             <wp:cNvGraphicFramePr>
               <a:graphicFrameLocks noChangeAspect="1"/>
             </wp:cNvGraphicFramePr>
@@ -2393,7 +2393,7 @@
               <a:graphicData uri="http://schemas.openxmlformats.org/drawingml/2006/picture">
                 <pic:pic>
                   <pic:nvPicPr>
-                    <pic:cNvPr id="0" name="05_clear_and_exit.png"/>
+                    <pic:cNvPr id="0" name="05_clear_before.png"/>
                     <pic:cNvPicPr/>
                   </pic:nvPicPr>
                   <pic:blipFill>
@@ -2405,7 +2405,7 @@
                   <pic:spPr>
                     <a:xfrm>
                       <a:off x="0" y="0"/>
-                      <a:ext cx="5943600" cy="1717040"/>
+                      <a:ext cx="5943600" cy="3895893"/>
                     </a:xfrm>
                     <a:prstGeom prst="rect"/>
                   </pic:spPr>
@@ -2451,7 +2451,143 @@
           <w:color w:val="000000"/>
           <w:sz w:val="24"/>
         </w:rPr>
-        <w:t>clear emits its ANSI control sequence, which is omitted from the text rendering. The integration test checks its exact bytes. echo executes in a background child, and exit 0 ends the shell. ANSI = American National Standards Institute.</w:t>
+        <w:t>The Terminal window retains earlier output, an echo result, and clear typed at the prompt before execution. Figure A6 shows the subsequent screen. The exact ANSI clear sequence is also checked by an integration test.</w:t>
+      </w:r>
+    </w:p>
+    <w:p>
+      <w:pPr>
+        <w:spacing w:after="0" w:line="240" w:lineRule="auto"/>
+      </w:pPr>
+      <w:r>
+        <w:br w:type="page"/>
+      </w:r>
+    </w:p>
+    <w:p>
+      <w:pPr>
+        <w:keepNext/>
+        <w:widowControl/>
+        <w:spacing w:before="0" w:after="0" w:line="480" w:lineRule="auto"/>
+        <w:ind w:firstLine="0" w:left="0"/>
+        <w:jc w:val="left"/>
+      </w:pPr>
+      <w:r>
+        <w:rPr>
+          <w:rFonts w:ascii="Times New Roman" w:hAnsi="Times New Roman" w:eastAsia="Times New Roman" w:cs="Times New Roman"/>
+          <w:b/>
+          <w:i w:val="0"/>
+          <w:color w:val="000000"/>
+          <w:sz w:val="24"/>
+        </w:rPr>
+        <w:t>Figure A6</w:t>
+      </w:r>
+    </w:p>
+    <w:p>
+      <w:pPr>
+        <w:keepNext/>
+        <w:widowControl/>
+        <w:spacing w:before="0" w:after="0" w:line="480" w:lineRule="auto"/>
+        <w:ind w:firstLine="0" w:left="0"/>
+        <w:jc w:val="left"/>
+      </w:pPr>
+      <w:r>
+        <w:rPr>
+          <w:rFonts w:ascii="Times New Roman" w:hAnsi="Times New Roman" w:eastAsia="Times New Roman" w:cs="Times New Roman"/>
+          <w:b w:val="0"/>
+          <w:i/>
+          <w:color w:val="000000"/>
+          <w:sz w:val="24"/>
+        </w:rPr>
+        <w:t>Terminal After Clear and Successful Shell Exit</w:t>
+      </w:r>
+    </w:p>
+    <w:p>
+      <w:pPr>
+        <w:keepNext/>
+        <w:widowControl/>
+        <w:spacing w:before="0" w:after="0" w:line="240" w:lineRule="auto"/>
+        <w:ind w:firstLine="0" w:left="0"/>
+        <w:jc w:val="left"/>
+      </w:pPr>
+      <w:r>
+        <w:rPr>
+          <w:rFonts w:ascii="Times New Roman" w:hAnsi="Times New Roman" w:eastAsia="Times New Roman" w:cs="Times New Roman"/>
+          <w:b w:val="0"/>
+          <w:i w:val="0"/>
+          <w:color w:val="000000"/>
+          <w:sz w:val="24"/>
+        </w:rPr>
+      </w:r>
+      <w:r>
+        <w:drawing>
+          <wp:inline xmlns:a="http://schemas.openxmlformats.org/drawingml/2006/main" xmlns:pic="http://schemas.openxmlformats.org/drawingml/2006/picture">
+            <wp:extent cx="5943600" cy="3861247"/>
+            <wp:docPr id="6" name="Picture 6" descr="Earlier output is absent after clear. The session shows echo output, background built-in completion, and exit 0. The parent zsh reports Shell exit status: 0, confirming the custom shell returned successfully."/>
+            <wp:cNvGraphicFramePr>
+              <a:graphicFrameLocks noChangeAspect="1"/>
+            </wp:cNvGraphicFramePr>
+            <a:graphic>
+              <a:graphicData uri="http://schemas.openxmlformats.org/drawingml/2006/picture">
+                <pic:pic>
+                  <pic:nvPicPr>
+                    <pic:cNvPr id="0" name="06_clear_and_exit.png"/>
+                    <pic:cNvPicPr/>
+                  </pic:nvPicPr>
+                  <pic:blipFill>
+                    <a:blip r:embed="rId15"/>
+                    <a:stretch>
+                      <a:fillRect/>
+                    </a:stretch>
+                  </pic:blipFill>
+                  <pic:spPr>
+                    <a:xfrm>
+                      <a:off x="0" y="0"/>
+                      <a:ext cx="5943600" cy="3861247"/>
+                    </a:xfrm>
+                    <a:prstGeom prst="rect"/>
+                  </pic:spPr>
+                </pic:pic>
+              </a:graphicData>
+            </a:graphic>
+          </wp:inline>
+        </w:drawing>
+      </w:r>
+    </w:p>
+    <w:p>
+      <w:pPr>
+        <w:keepNext w:val="0"/>
+        <w:widowControl/>
+        <w:spacing w:before="0" w:after="0" w:line="480" w:lineRule="auto"/>
+        <w:ind w:firstLine="0" w:left="0"/>
+        <w:jc w:val="left"/>
+      </w:pPr>
+      <w:r>
+        <w:rPr>
+          <w:rFonts w:ascii="Times New Roman" w:hAnsi="Times New Roman" w:eastAsia="Times New Roman" w:cs="Times New Roman"/>
+          <w:b w:val="0"/>
+          <w:i w:val="0"/>
+          <w:color w:val="000000"/>
+          <w:sz w:val="24"/>
+        </w:rPr>
+      </w:r>
+      <w:r>
+        <w:rPr>
+          <w:rFonts w:ascii="Times New Roman" w:hAnsi="Times New Roman" w:eastAsia="Times New Roman" w:cs="Times New Roman"/>
+          <w:b w:val="0"/>
+          <w:i/>
+          <w:color w:val="000000"/>
+          <w:sz w:val="24"/>
+        </w:rPr>
+        <w:t xml:space="preserve">Note. </w:t>
+      </w:r>
+      <w:r>
+        <w:rPr>
+          <w:rFonts w:ascii="Times New Roman" w:hAnsi="Times New Roman" w:eastAsia="Times New Roman" w:cs="Times New Roman"/>
+          <w:b w:val="0"/>
+          <w:i w:val="0"/>
+          <w:color w:val="000000"/>
+          <w:sz w:val="24"/>
+        </w:rPr>
+        <w:t>Earlier output is absent after clear. The session shows echo output, background built-in completion, and exit 0. The parent zsh reports Shell exit status: 0, confirming the custom shell returned successfully.</w:t>
       </w:r>
     </w:p>
     <w:p>
@@ -2518,7 +2654,7 @@
           <w:color w:val="000000"/>
           <w:sz w:val="24"/>
         </w:rPr>
-        <w:t>Table B1 maps every required command to implementation behavior and direct verification. The source, Makefile, tests, README, benchmark data, screenshots, and transcripts accompany this report. Build with make, run ./build/os-shell, and verify with make test. GitHub publication is deferred.</w:t>
+        <w:t>Table B1 maps every required command to implementation behavior and direct verification. The source, Makefile, tests, README, benchmark data, native screenshots, and supplemental PTY transcripts accompany this report. Build with make, run ./build/os-shell, and verify with make test. The project repository is https://github.com/sdhamania/Advanced_OS_Residency_Deliverable1.</w:t>
       </w:r>
     </w:p>
     <w:p>
@@ -2952,7 +3088,7 @@
                 <w:color w:val="000000"/>
                 <w:sz w:val="24"/>
               </w:rPr>
-              <w:t>A5; exit tests</w:t>
+              <w:t>A6; exit tests</w:t>
             </w:r>
           </w:p>
         </w:tc>
@@ -3044,7 +3180,7 @@
                 <w:color w:val="000000"/>
                 <w:sz w:val="24"/>
               </w:rPr>
-              <w:t>A1; A5</w:t>
+              <w:t>A1; A6</w:t>
             </w:r>
           </w:p>
         </w:tc>
@@ -3136,7 +3272,7 @@
                 <w:color w:val="000000"/>
                 <w:sz w:val="24"/>
               </w:rPr>
-              <w:t>A5; byte test</w:t>
+              <w:t>A5–A6; byte test</w:t>
             </w:r>
           </w:p>
         </w:tc>
@@ -3504,7 +3640,7 @@
                 <w:color w:val="000000"/>
                 <w:sz w:val="24"/>
               </w:rPr>
-              <w:t>A1; A4; link tests</w:t>
+              <w:t>A1; link tests</w:t>
             </w:r>
           </w:p>
         </w:tc>
@@ -3596,7 +3732,7 @@
                 <w:color w:val="000000"/>
                 <w:sz w:val="24"/>
               </w:rPr>
-              <w:t>A1; A4; link tests</w:t>
+              <w:t>A1; link tests</w:t>
             </w:r>
           </w:p>
         </w:tc>
@@ -4097,7 +4233,7 @@
           <w:color w:val="000000"/>
           <w:sz w:val="24"/>
         </w:rPr>
-        <w:t>A1–A5 refer to Figures A1–A5. cwd = current working directory. Both numeric job IDs and percent-prefixed IDs are accepted. With no ID, fg and bg use the most recent active job.</w:t>
+        <w:t>A1–A6 refer to Figures A1–A6. cwd = current working directory. Both numeric job IDs and percent-prefixed IDs are accepted. With no ID, fg and bg use the most recent active job.</w:t>
       </w:r>
     </w:p>
     <w:sectPr>

</xml_diff>